<commit_message>
add mock proposaldoc for /broker chat
</commit_message>
<xml_diff>
--- a/backend/app/static/proposals/0aa3092c-2306-4808-bf95-57b92cb6ba58.docx
+++ b/backend/app/static/proposals/0aa3092c-2306-4808-bf95-57b92cb6ba58.docx
@@ -74,7 +74,7 @@
         <w:pStyle w:val="ListBullet"/>
       </w:pPr>
       <w:r>
-        <w:t>The Luther Corp Cybersecurity Defence System aims to provide a comprehensive defence against cyber threats, leveraging advanced technologies to safeguard against potential digital attacks.</w:t>
+        <w:t>The Luther Corp Cybersecurity Defence System is designed to protect against advanced cyber threats, leveraging cutting-edge technologies to safeguard against potential digital attacks.</w:t>
       </w:r>
     </w:p>
     <w:p>
@@ -82,7 +82,7 @@
         <w:pStyle w:val="ListBullet"/>
       </w:pPr>
       <w:r>
-        <w:t>The proposed system will utilize a combination of React, Node, Express, and MongoDB to ensure a robust and scalable solution.</w:t>
+        <w:t>The proposed system will utilize a combination of Artificial Intelligence (AI) and Machine Learning (ML) to detect and respond to threats in real-time.</w:t>
       </w:r>
     </w:p>
     <w:p>
@@ -90,7 +90,7 @@
         <w:pStyle w:val="ListBullet"/>
       </w:pPr>
       <w:r>
-        <w:t>Artificial Intelligence (AI) and Machine Learning (ML) will be integrated to improve threat detection and incident response.</w:t>
+        <w:t>The system will be built using a microservices architecture, with a focus on scalability, security, and high availability.</w:t>
       </w:r>
     </w:p>
     <w:p>
@@ -98,7 +98,7 @@
         <w:pStyle w:val="ListBullet"/>
       </w:pPr>
       <w:r>
-        <w:t>The system will be designed with high-level scalability, security, and hosting considerations to ensure the protection of sensitive data.</w:t>
+        <w:t>The expected business outcomes include improved incident response times, reduced risk of data breaches, and enhanced overall cybersecurity posture.</w:t>
       </w:r>
     </w:p>
     <w:p>
@@ -106,7 +106,7 @@
         <w:pStyle w:val="ListBullet"/>
       </w:pPr>
       <w:r>
-        <w:t>The expected business outcomes include enhanced cybersecurity posture, improved incident response, and reduced risk of data breaches.</w:t>
+        <w:t>The system will be designed with high-level scalability, security, and hosting considerations in mind, including compliance with relevant regulatory requirements.</w:t>
       </w:r>
     </w:p>
     <w:p>
@@ -114,7 +114,15 @@
         <w:pStyle w:val="ListBullet"/>
       </w:pPr>
       <w:r>
-        <w:t>The system will be deployed on Amazon Web Services (AWS) with API Gateway, Lambda, and S3 to ensure a secure and reliable infrastructure.</w:t>
+        <w:t>The system will provide real-time monitoring and analytics, enabling swift identification and mitigation of potential threats.</w:t>
+      </w:r>
+    </w:p>
+    <w:p>
+      <w:pPr>
+        <w:pStyle w:val="ListBullet"/>
+      </w:pPr>
+      <w:r>
+        <w:t>The proposed system will be integrated with existing security systems, providing a comprehensive and unified cybersecurity solution.</w:t>
       </w:r>
     </w:p>
     <w:p>
@@ -140,7 +148,7 @@
     </w:p>
     <w:p>
       <w:r>
-        <w:t>In this phase, our team will conduct a thorough analysis of the current cybersecurity landscape and identify potential threats and vulnerabilities. We will work closely with stakeholders to gather business requirements and define the scope of the project. The team will also analyze existing workflows, identify user roles and permissions, define system behavior, and document any business rules or constraints. All gathered requirements will be reviewed, prioritized, and compiled into a detailed Software Requirements Specification (SRS) document.</w:t>
+        <w:t>The first phase of the project will involve gathering and analyzing business requirements, identifying user roles and permissions, defining system behavior, and documenting any business rules or constraints. This phase will also involve conducting a thorough risk assessment to identify potential vulnerabilities and threats. The output of this phase will be a detailed Software Requirements Specification (SRS) document, which will serve as the foundation for the design and development phases.</w:t>
       </w:r>
     </w:p>
     <w:p>
@@ -153,7 +161,7 @@
     </w:p>
     <w:p>
       <w:r>
-        <w:t>In this phase, our team will design a comprehensive architecture for the cybersecurity defence system. We will define the core functional scope and modules, primary user workflow, application security and authentication, core data management and reporting, and key integrations or administrative panels. The team will also develop a detailed system design document that outlines the technical specifications and infrastructure requirements.</w:t>
+        <w:t>In this phase, the team will design the overall system architecture, including the database schema, backend API, and frontend user interface. The team will also define the system's security and authentication mechanisms, including the use of encryption, firewalls, and access controls. The output of this phase will be a detailed System Design Document (SDD), which will outline the system's components, interfaces, and interactions.</w:t>
       </w:r>
     </w:p>
     <w:p>
@@ -161,12 +169,12 @@
         <w:pStyle w:val="ListBullet"/>
       </w:pPr>
       <w:r>
-        <w:t>Phase 3: Frontend Development**</w:t>
+        <w:t>Phase 3: Database Design and Development**</w:t>
       </w:r>
     </w:p>
     <w:p>
       <w:r>
-        <w:t>In this phase, our team will develop the frontend of the cybersecurity defence system using React.js with Vite and Redux. We will design a user-friendly and responsive interface that provides real-time threat intelligence and incident response capabilities. The team will also develop a customizable dashboard that allows users to monitor and analyze security-related data.</w:t>
+        <w:t>The third phase of the project will involve designing and developing the database schema, including the definition of data models, relationships, and constraints. The team will also develop the database using MongoDB with Atlas and Elasticsearch, and integrate it with the backend API. The output of this phase will be a fully functional database, with all necessary data models and relationships defined.</w:t>
       </w:r>
     </w:p>
     <w:p>
@@ -174,12 +182,12 @@
         <w:pStyle w:val="ListBullet"/>
       </w:pPr>
       <w:r>
-        <w:t>Phase 4: Backend Development**</w:t>
+        <w:t>Phase 4: Backend API Development**</w:t>
       </w:r>
     </w:p>
     <w:p>
       <w:r>
-        <w:t>In this phase, our team will develop the backend of the cybersecurity defence system using Node.js with Express.js and GraphQL. We will design a robust and scalable API that integrates with various security tools and systems. The team will also develop a comprehensive data management system that stores and analyzes security-related data.</w:t>
+        <w:t>In this phase, the team will develop the backend API using Node.js with Express.js and GraphQL, including the definition of API endpoints, data models, and business logic. The team will also integrate the backend API with the database, and implement security and authentication mechanisms. The output of this phase will be a fully functional backend API, with all necessary endpoints and business logic defined.</w:t>
       </w:r>
     </w:p>
     <w:p>
@@ -187,12 +195,12 @@
         <w:pStyle w:val="ListBullet"/>
       </w:pPr>
       <w:r>
-        <w:t>Phase 5: Artificial Intelligence and Machine Learning Integration**</w:t>
+        <w:t>Phase 5: Frontend Development**</w:t>
       </w:r>
     </w:p>
     <w:p>
       <w:r>
-        <w:t>In this phase, our team will integrate AI and ML capabilities into the cybersecurity defence system. We will develop predictive models that detect and respond to potential threats in real-time. The team will also develop a natural language processing (NLP) module that analyzes and responds to security-related queries.</w:t>
+        <w:t>The fifth phase of the project will involve developing the frontend user interface using React.js with Vite and Redux, including the definition of user interface components, layouts, and interactions. The team will also integrate the frontend with the backend API, and implement security and authentication mechanisms. The output of this phase will be a fully functional frontend, with all necessary user interface components and interactions defined.</w:t>
       </w:r>
     </w:p>
     <w:p>
@@ -205,7 +213,7 @@
     </w:p>
     <w:p>
       <w:r>
-        <w:t>In this phase, our team will conduct thorough testing and quality assurance of the cybersecurity defence system. We will perform unit testing, integration testing, and system testing to ensure that the system meets the required specifications and is free from defects. The team will also conduct security testing and penetration testing to identify and mitigate potential vulnerabilities.</w:t>
+        <w:t>In this phase, the team will conduct thorough testing and quality assurance, including unit testing, integration testing, and system testing. The team will also conduct security testing and performance validation, to ensure that the system meets all necessary security and performance requirements. The output of this phase will be a fully tested and validated system, with all necessary defects and issues identified and resolved.</w:t>
       </w:r>
     </w:p>
     <w:p>
@@ -218,7 +226,12 @@
     </w:p>
     <w:p>
       <w:r>
-        <w:t>In this phase, our team will deploy the cybersecurity defence system on AWS with API Gateway, Lambda, and S3. We will ensure that the system is properly configured and secured to prevent any potential attacks. The team will also provide ongoing maintenance and support to ensure that the system remains up-to-date and effective in detecting and responding to potential threats.</w:t>
+        <w:t>The final phase of the project will involve deploying the system to production, including the setup of necessary infrastructure, configuration of security and authentication mechanisms, and integration with existing systems. The team will also provide ongoing maintenance and support, including the identification and resolution of defects and issues, and the implementation of necessary updates and upgrades. The output of this phase will be a fully deployed and operational system, with all necessary maintenance and support activities defined and implemented.</w:t>
+      </w:r>
+    </w:p>
+    <w:p>
+      <w:r>
+        <w:t>The scope of the project includes the design, development, testing, and deployment of a comprehensive cybersecurity defence system, including all necessary components, interfaces, and interactions. The system will be designed to protect against advanced cyber threats, leveraging cutting-edge technologies to safeguard against potential digital attacks. The system will be built using a microservices architecture, with a focus on scalability, security, and high availability.</w:t>
       </w:r>
     </w:p>
     <w:p>
@@ -507,7 +520,7 @@
           </w:tcPr>
           <w:p>
             <w:r>
-              <w:t>Amazon Web Services (AWS) with API Gateway, Lambda, and S3</w:t>
+              <w:t>AWS with API Gateway, Lambda, and S3</w:t>
             </w:r>
           </w:p>
         </w:tc>
@@ -557,7 +570,7 @@
           </w:tcPr>
           <w:p>
             <w:r>
-              <w:t>Machine Learning (ML) and Natural Language Processing (NLP) using TensorFlow and NLTK</w:t>
+              <w:t>Machine Learning (ML) using TensorFlow and scikit-learn</w:t>
             </w:r>
           </w:p>
         </w:tc>
@@ -919,7 +932,107 @@
           </w:tcPr>
           <w:p>
             <w:r>
-              <w:t>System design document</w:t>
+              <w:t>System Design Document (SDD)</w:t>
+            </w:r>
+          </w:p>
+        </w:tc>
+      </w:tr>
+      <w:tr>
+        <w:tc>
+          <w:tcPr>
+            <w:tcW w:type="dxa" w:w="3120"/>
+            <w:tcMar>
+              <w:top w:w="100" w:type="dxa"/>
+              <w:bottom w:w="100" w:type="dxa"/>
+              <w:left w:w="150" w:type="dxa"/>
+              <w:right w:w="150" w:type="dxa"/>
+            </w:tcMar>
+          </w:tcPr>
+          <w:p>
+            <w:r>
+              <w:t>Database Design and Development</w:t>
+            </w:r>
+          </w:p>
+        </w:tc>
+        <w:tc>
+          <w:tcPr>
+            <w:tcW w:type="dxa" w:w="3120"/>
+            <w:tcMar>
+              <w:top w:w="100" w:type="dxa"/>
+              <w:bottom w:w="100" w:type="dxa"/>
+              <w:left w:w="150" w:type="dxa"/>
+              <w:right w:w="150" w:type="dxa"/>
+            </w:tcMar>
+          </w:tcPr>
+          <w:p>
+            <w:r>
+              <w:t>3 Weeks</w:t>
+            </w:r>
+          </w:p>
+        </w:tc>
+        <w:tc>
+          <w:tcPr>
+            <w:tcW w:type="dxa" w:w="3120"/>
+            <w:tcMar>
+              <w:top w:w="100" w:type="dxa"/>
+              <w:bottom w:w="100" w:type="dxa"/>
+              <w:left w:w="150" w:type="dxa"/>
+              <w:right w:w="150" w:type="dxa"/>
+            </w:tcMar>
+          </w:tcPr>
+          <w:p>
+            <w:r>
+              <w:t>Fully functional database</w:t>
+            </w:r>
+          </w:p>
+        </w:tc>
+      </w:tr>
+      <w:tr>
+        <w:tc>
+          <w:tcPr>
+            <w:tcW w:type="dxa" w:w="3120"/>
+            <w:tcMar>
+              <w:top w:w="100" w:type="dxa"/>
+              <w:bottom w:w="100" w:type="dxa"/>
+              <w:left w:w="150" w:type="dxa"/>
+              <w:right w:w="150" w:type="dxa"/>
+            </w:tcMar>
+          </w:tcPr>
+          <w:p>
+            <w:r>
+              <w:t>Backend API Development</w:t>
+            </w:r>
+          </w:p>
+        </w:tc>
+        <w:tc>
+          <w:tcPr>
+            <w:tcW w:type="dxa" w:w="3120"/>
+            <w:tcMar>
+              <w:top w:w="100" w:type="dxa"/>
+              <w:bottom w:w="100" w:type="dxa"/>
+              <w:left w:w="150" w:type="dxa"/>
+              <w:right w:w="150" w:type="dxa"/>
+            </w:tcMar>
+          </w:tcPr>
+          <w:p>
+            <w:r>
+              <w:t>4 Weeks</w:t>
+            </w:r>
+          </w:p>
+        </w:tc>
+        <w:tc>
+          <w:tcPr>
+            <w:tcW w:type="dxa" w:w="3120"/>
+            <w:tcMar>
+              <w:top w:w="100" w:type="dxa"/>
+              <w:bottom w:w="100" w:type="dxa"/>
+              <w:left w:w="150" w:type="dxa"/>
+              <w:right w:w="150" w:type="dxa"/>
+            </w:tcMar>
+          </w:tcPr>
+          <w:p>
+            <w:r>
+              <w:t>Fully functional backend API</w:t>
             </w:r>
           </w:p>
         </w:tc>
@@ -969,107 +1082,7 @@
           </w:tcPr>
           <w:p>
             <w:r>
-              <w:t>Functional frontend with user-friendly interface</w:t>
-            </w:r>
-          </w:p>
-        </w:tc>
-      </w:tr>
-      <w:tr>
-        <w:tc>
-          <w:tcPr>
-            <w:tcW w:type="dxa" w:w="3120"/>
-            <w:tcMar>
-              <w:top w:w="100" w:type="dxa"/>
-              <w:bottom w:w="100" w:type="dxa"/>
-              <w:left w:w="150" w:type="dxa"/>
-              <w:right w:w="150" w:type="dxa"/>
-            </w:tcMar>
-          </w:tcPr>
-          <w:p>
-            <w:r>
-              <w:t>Backend Development</w:t>
-            </w:r>
-          </w:p>
-        </w:tc>
-        <w:tc>
-          <w:tcPr>
-            <w:tcW w:type="dxa" w:w="3120"/>
-            <w:tcMar>
-              <w:top w:w="100" w:type="dxa"/>
-              <w:bottom w:w="100" w:type="dxa"/>
-              <w:left w:w="150" w:type="dxa"/>
-              <w:right w:w="150" w:type="dxa"/>
-            </w:tcMar>
-          </w:tcPr>
-          <w:p>
-            <w:r>
-              <w:t>4 Weeks</w:t>
-            </w:r>
-          </w:p>
-        </w:tc>
-        <w:tc>
-          <w:tcPr>
-            <w:tcW w:type="dxa" w:w="3120"/>
-            <w:tcMar>
-              <w:top w:w="100" w:type="dxa"/>
-              <w:bottom w:w="100" w:type="dxa"/>
-              <w:left w:w="150" w:type="dxa"/>
-              <w:right w:w="150" w:type="dxa"/>
-            </w:tcMar>
-          </w:tcPr>
-          <w:p>
-            <w:r>
-              <w:t>Functional backend with robust API</w:t>
-            </w:r>
-          </w:p>
-        </w:tc>
-      </w:tr>
-      <w:tr>
-        <w:tc>
-          <w:tcPr>
-            <w:tcW w:type="dxa" w:w="3120"/>
-            <w:tcMar>
-              <w:top w:w="100" w:type="dxa"/>
-              <w:bottom w:w="100" w:type="dxa"/>
-              <w:left w:w="150" w:type="dxa"/>
-              <w:right w:w="150" w:type="dxa"/>
-            </w:tcMar>
-          </w:tcPr>
-          <w:p>
-            <w:r>
-              <w:t>Artificial Intelligence and Machine Learning Integration</w:t>
-            </w:r>
-          </w:p>
-        </w:tc>
-        <w:tc>
-          <w:tcPr>
-            <w:tcW w:type="dxa" w:w="3120"/>
-            <w:tcMar>
-              <w:top w:w="100" w:type="dxa"/>
-              <w:bottom w:w="100" w:type="dxa"/>
-              <w:left w:w="150" w:type="dxa"/>
-              <w:right w:w="150" w:type="dxa"/>
-            </w:tcMar>
-          </w:tcPr>
-          <w:p>
-            <w:r>
-              <w:t>2 Weeks</w:t>
-            </w:r>
-          </w:p>
-        </w:tc>
-        <w:tc>
-          <w:tcPr>
-            <w:tcW w:type="dxa" w:w="3120"/>
-            <w:tcMar>
-              <w:top w:w="100" w:type="dxa"/>
-              <w:bottom w:w="100" w:type="dxa"/>
-              <w:left w:w="150" w:type="dxa"/>
-              <w:right w:w="150" w:type="dxa"/>
-            </w:tcMar>
-          </w:tcPr>
-          <w:p>
-            <w:r>
-              <w:t>Integrated AI and ML capabilities</w:t>
+              <w:t>Fully functional frontend</w:t>
             </w:r>
           </w:p>
         </w:tc>
@@ -1103,7 +1116,7 @@
           </w:tcPr>
           <w:p>
             <w:r>
-              <w:t>2 Weeks</w:t>
+              <w:t>3 Weeks</w:t>
             </w:r>
           </w:p>
         </w:tc>
@@ -1119,7 +1132,7 @@
           </w:tcPr>
           <w:p>
             <w:r>
-              <w:t>Tested and validated system</w:t>
+              <w:t>Fully tested and validated system</w:t>
             </w:r>
           </w:p>
         </w:tc>
@@ -1169,7 +1182,7 @@
           </w:tcPr>
           <w:p>
             <w:r>
-              <w:t>Deployed system with ongoing maintenance and support</w:t>
+              <w:t>Fully deployed and operational system</w:t>
             </w:r>
           </w:p>
         </w:tc>
@@ -1204,42 +1217,52 @@
     </w:p>
     <w:p>
       <w:r>
-        <w:t>The client will provide access to relevant stakeholders and subject matter experts throughout the project.</w:t>
+        <w:t>The client will provide necessary access to existing systems and infrastructure.</w:t>
       </w:r>
     </w:p>
     <w:p>
       <w:r>
-        <w:t>The client will provide necessary infrastructure and equipment for testing and deployment.</w:t>
+        <w:t>The client will provide necessary documentation and information about existing security systems and protocols.</w:t>
       </w:r>
     </w:p>
     <w:p>
       <w:r>
-        <w:t>The client will provide access to third-party APIs and systems for integration.</w:t>
+        <w:t>The client will be available to provide feedback and input throughout the project.</w:t>
       </w:r>
     </w:p>
     <w:p>
       <w:r>
-        <w:t>The AI and ML models will be trained on relevant data sets to ensure accuracy and effectiveness.</w:t>
+        <w:t>The project timeline and budget will be sufficient to complete all necessary tasks and deliverables.</w:t>
       </w:r>
     </w:p>
     <w:p>
       <w:r>
-        <w:t>The client will provide necessary security approvals and compliance documentation.</w:t>
+        <w:t>The project team will have necessary skills and expertise to complete all tasks and deliverables.</w:t>
       </w:r>
     </w:p>
     <w:p>
       <w:r>
-        <w:t>The client will provide access to testing environment and security testing tools.</w:t>
+        <w:t>The project team will have access to necessary tools and technologies to complete all tasks and deliverables.</w:t>
       </w:r>
     </w:p>
     <w:p>
       <w:r>
-        <w:t>The client will provide necessary deployment approvals and documentation.</w:t>
+        <w:t>The client will provide necessary testing and validation environments and data.</w:t>
       </w:r>
     </w:p>
     <w:p>
       <w:r>
-        <w:t>The client will provide ongoing maintenance and support resources.</w:t>
+        <w:t>The project team will be able to integrate with existing systems and infrastructure without significant issues or delays.</w:t>
+      </w:r>
+    </w:p>
+    <w:p>
+      <w:r>
+        <w:t>The project team will be able to obtain necessary security approvals and certifications.</w:t>
+      </w:r>
+    </w:p>
+    <w:p>
+      <w:r>
+        <w:t>The project team will be able to deploy the system to production without significant issues or delays.</w:t>
       </w:r>
     </w:p>
     <w:p>
@@ -1257,32 +1280,52 @@
     </w:p>
     <w:p>
       <w:r>
-        <w:t>Risk: Changes in business requirements during development. Mitigation: Adopt Agile sprint planning with regular stakeholder reviews.</w:t>
+        <w:t>Changes in business requirements during development.</w:t>
       </w:r>
     </w:p>
     <w:p>
       <w:r>
-        <w:t>Risk: Delays in receiving necessary infrastructure and equipment. Mitigation: Develop a contingency plan for alternative infrastructure and equipment.</w:t>
+        <w:t>Delays in receiving necessary feedback and input from the client.</w:t>
       </w:r>
     </w:p>
     <w:p>
       <w:r>
-        <w:t>Risk: Integration issues with third-party APIs and systems. Mitigation: Develop a comprehensive integration testing plan.</w:t>
+        <w:t>Issues with integrating with existing systems and infrastructure.</w:t>
       </w:r>
     </w:p>
     <w:p>
       <w:r>
-        <w:t>Risk: Inaccurate AI and ML models. Mitigation: Develop a comprehensive training and testing plan for AI and ML models.</w:t>
+        <w:t>Delays in obtaining necessary security approvals and certifications.</w:t>
       </w:r>
     </w:p>
     <w:p>
       <w:r>
-        <w:t>Risk: Security breaches during testing and deployment. Mitigation: Develop a comprehensive security testing plan and ensure necessary security approvals and compliance documentation.</w:t>
+        <w:t>Issues with deploying the system to production.</w:t>
       </w:r>
     </w:p>
     <w:p>
       <w:r>
-        <w:t>Risk: Delays in receiving necessary deployment approvals. Mitigation: Develop a contingency plan for alternative deployment strategies.</w:t>
+        <w:t>Changes in project timeline and budget.</w:t>
+      </w:r>
+    </w:p>
+    <w:p>
+      <w:r>
+        <w:t>Issues with accessing necessary tools and technologies.</w:t>
+      </w:r>
+    </w:p>
+    <w:p>
+      <w:r>
+        <w:t>Delays in receiving necessary testing and validation environments and data.</w:t>
+      </w:r>
+    </w:p>
+    <w:p>
+      <w:r>
+        <w:t>Issues with obtaining necessary access to existing systems and infrastructure.</w:t>
+      </w:r>
+    </w:p>
+    <w:p>
+      <w:r>
+        <w:t>Changes in project scope and requirements.</w:t>
       </w:r>
     </w:p>
     <w:p>
@@ -1387,7 +1430,7 @@
           </w:tcPr>
           <w:p>
             <w:r>
-              <w:t>Senior Software Engineer</w:t>
+              <w:t>Project Manager</w:t>
             </w:r>
           </w:p>
         </w:tc>
@@ -1403,7 +1446,7 @@
           </w:tcPr>
           <w:p>
             <w:r>
-              <w:t>Lead Developer</w:t>
+              <w:t>Project Management</w:t>
             </w:r>
           </w:p>
         </w:tc>
@@ -1419,7 +1462,7 @@
           </w:tcPr>
           <w:p>
             <w:r>
-              <w:t>800 Hours</w:t>
+              <w:t>320 Hours</w:t>
             </w:r>
           </w:p>
         </w:tc>
@@ -1437,7 +1480,7 @@
           </w:tcPr>
           <w:p>
             <w:r>
-              <w:t>Junior Software Engineer</w:t>
+              <w:t>Software Engineer</w:t>
             </w:r>
           </w:p>
         </w:tc>
@@ -1453,7 +1496,7 @@
           </w:tcPr>
           <w:p>
             <w:r>
-              <w:t>Developer</w:t>
+              <w:t>Backend Development</w:t>
             </w:r>
           </w:p>
         </w:tc>
@@ -1469,7 +1512,107 @@
           </w:tcPr>
           <w:p>
             <w:r>
-              <w:t>400 Hours</w:t>
+              <w:t>640 Hours</w:t>
+            </w:r>
+          </w:p>
+        </w:tc>
+      </w:tr>
+      <w:tr>
+        <w:tc>
+          <w:tcPr>
+            <w:tcW w:type="dxa" w:w="3120"/>
+            <w:tcMar>
+              <w:top w:w="100" w:type="dxa"/>
+              <w:bottom w:w="100" w:type="dxa"/>
+              <w:left w:w="150" w:type="dxa"/>
+              <w:right w:w="150" w:type="dxa"/>
+            </w:tcMar>
+          </w:tcPr>
+          <w:p>
+            <w:r>
+              <w:t>Software Engineer</w:t>
+            </w:r>
+          </w:p>
+        </w:tc>
+        <w:tc>
+          <w:tcPr>
+            <w:tcW w:type="dxa" w:w="3120"/>
+            <w:tcMar>
+              <w:top w:w="100" w:type="dxa"/>
+              <w:bottom w:w="100" w:type="dxa"/>
+              <w:left w:w="150" w:type="dxa"/>
+              <w:right w:w="150" w:type="dxa"/>
+            </w:tcMar>
+          </w:tcPr>
+          <w:p>
+            <w:r>
+              <w:t>Frontend Development</w:t>
+            </w:r>
+          </w:p>
+        </w:tc>
+        <w:tc>
+          <w:tcPr>
+            <w:tcW w:type="dxa" w:w="3120"/>
+            <w:tcMar>
+              <w:top w:w="100" w:type="dxa"/>
+              <w:bottom w:w="100" w:type="dxa"/>
+              <w:left w:w="150" w:type="dxa"/>
+              <w:right w:w="150" w:type="dxa"/>
+            </w:tcMar>
+          </w:tcPr>
+          <w:p>
+            <w:r>
+              <w:t>640 Hours</w:t>
+            </w:r>
+          </w:p>
+        </w:tc>
+      </w:tr>
+      <w:tr>
+        <w:tc>
+          <w:tcPr>
+            <w:tcW w:type="dxa" w:w="3120"/>
+            <w:tcMar>
+              <w:top w:w="100" w:type="dxa"/>
+              <w:bottom w:w="100" w:type="dxa"/>
+              <w:left w:w="150" w:type="dxa"/>
+              <w:right w:w="150" w:type="dxa"/>
+            </w:tcMar>
+          </w:tcPr>
+          <w:p>
+            <w:r>
+              <w:t>Quality Assurance Engineer</w:t>
+            </w:r>
+          </w:p>
+        </w:tc>
+        <w:tc>
+          <w:tcPr>
+            <w:tcW w:type="dxa" w:w="3120"/>
+            <w:tcMar>
+              <w:top w:w="100" w:type="dxa"/>
+              <w:bottom w:w="100" w:type="dxa"/>
+              <w:left w:w="150" w:type="dxa"/>
+              <w:right w:w="150" w:type="dxa"/>
+            </w:tcMar>
+          </w:tcPr>
+          <w:p>
+            <w:r>
+              <w:t>Testing and Quality Assurance</w:t>
+            </w:r>
+          </w:p>
+        </w:tc>
+        <w:tc>
+          <w:tcPr>
+            <w:tcW w:type="dxa" w:w="3120"/>
+            <w:tcMar>
+              <w:top w:w="100" w:type="dxa"/>
+              <w:bottom w:w="100" w:type="dxa"/>
+              <w:left w:w="150" w:type="dxa"/>
+              <w:right w:w="150" w:type="dxa"/>
+            </w:tcMar>
+          </w:tcPr>
+          <w:p>
+            <w:r>
+              <w:t>320 Hours</w:t>
             </w:r>
           </w:p>
         </w:tc>
@@ -1519,107 +1662,7 @@
           </w:tcPr>
           <w:p>
             <w:r>
-              <w:t>200 Hours</w:t>
-            </w:r>
-          </w:p>
-        </w:tc>
-      </w:tr>
-      <w:tr>
-        <w:tc>
-          <w:tcPr>
-            <w:tcW w:type="dxa" w:w="3120"/>
-            <w:tcMar>
-              <w:top w:w="100" w:type="dxa"/>
-              <w:bottom w:w="100" w:type="dxa"/>
-              <w:left w:w="150" w:type="dxa"/>
-              <w:right w:w="150" w:type="dxa"/>
-            </w:tcMar>
-          </w:tcPr>
-          <w:p>
-            <w:r>
-              <w:t>Quality Assurance Engineer</w:t>
-            </w:r>
-          </w:p>
-        </w:tc>
-        <w:tc>
-          <w:tcPr>
-            <w:tcW w:type="dxa" w:w="3120"/>
-            <w:tcMar>
-              <w:top w:w="100" w:type="dxa"/>
-              <w:bottom w:w="100" w:type="dxa"/>
-              <w:left w:w="150" w:type="dxa"/>
-              <w:right w:w="150" w:type="dxa"/>
-            </w:tcMar>
-          </w:tcPr>
-          <w:p>
-            <w:r>
-              <w:t>Testing and Quality Assurance</w:t>
-            </w:r>
-          </w:p>
-        </w:tc>
-        <w:tc>
-          <w:tcPr>
-            <w:tcW w:type="dxa" w:w="3120"/>
-            <w:tcMar>
-              <w:top w:w="100" w:type="dxa"/>
-              <w:bottom w:w="100" w:type="dxa"/>
-              <w:left w:w="150" w:type="dxa"/>
-              <w:right w:w="150" w:type="dxa"/>
-            </w:tcMar>
-          </w:tcPr>
-          <w:p>
-            <w:r>
-              <w:t>200 Hours</w:t>
-            </w:r>
-          </w:p>
-        </w:tc>
-      </w:tr>
-      <w:tr>
-        <w:tc>
-          <w:tcPr>
-            <w:tcW w:type="dxa" w:w="3120"/>
-            <w:tcMar>
-              <w:top w:w="100" w:type="dxa"/>
-              <w:bottom w:w="100" w:type="dxa"/>
-              <w:left w:w="150" w:type="dxa"/>
-              <w:right w:w="150" w:type="dxa"/>
-            </w:tcMar>
-          </w:tcPr>
-          <w:p>
-            <w:r>
-              <w:t>Project Manager</w:t>
-            </w:r>
-          </w:p>
-        </w:tc>
-        <w:tc>
-          <w:tcPr>
-            <w:tcW w:type="dxa" w:w="3120"/>
-            <w:tcMar>
-              <w:top w:w="100" w:type="dxa"/>
-              <w:bottom w:w="100" w:type="dxa"/>
-              <w:left w:w="150" w:type="dxa"/>
-              <w:right w:w="150" w:type="dxa"/>
-            </w:tcMar>
-          </w:tcPr>
-          <w:p>
-            <w:r>
-              <w:t>Project Management</w:t>
-            </w:r>
-          </w:p>
-        </w:tc>
-        <w:tc>
-          <w:tcPr>
-            <w:tcW w:type="dxa" w:w="3120"/>
-            <w:tcMar>
-              <w:top w:w="100" w:type="dxa"/>
-              <w:bottom w:w="100" w:type="dxa"/>
-              <w:left w:w="150" w:type="dxa"/>
-              <w:right w:w="150" w:type="dxa"/>
-            </w:tcMar>
-          </w:tcPr>
-          <w:p>
-            <w:r>
-              <w:t>100 Hours</w:t>
+              <w:t>160 Hours</w:t>
             </w:r>
           </w:p>
         </w:tc>

</xml_diff>

<commit_message>
Recreated the black poc ui bside neociation chat
</commit_message>
<xml_diff>
--- a/backend/app/static/proposals/0aa3092c-2306-4808-bf95-57b92cb6ba58.docx
+++ b/backend/app/static/proposals/0aa3092c-2306-4808-bf95-57b92cb6ba58.docx
@@ -74,7 +74,7 @@
         <w:pStyle w:val="ListBullet"/>
       </w:pPr>
       <w:r>
-        <w:t>The Luther Corp Cybersecurity Defence System is designed to protect against advanced cyber threats, leveraging cutting-edge technologies to safeguard against potential digital attacks.</w:t>
+        <w:t>The Luther Corp Cybersecurity Defence System aims to provide a comprehensive defence against cyber threats, leveraging advanced technologies to safeguard against potential digital attacks.</w:t>
       </w:r>
     </w:p>
     <w:p>
@@ -82,7 +82,7 @@
         <w:pStyle w:val="ListBullet"/>
       </w:pPr>
       <w:r>
-        <w:t>The proposed system will utilize a combination of Artificial Intelligence (AI) and Machine Learning (ML) to detect and respond to threats in real-time.</w:t>
+        <w:t>The proposed solution will utilize a combination of React, Node, Express, and MongoDB to ensure a robust and scalable system.</w:t>
       </w:r>
     </w:p>
     <w:p>
@@ -90,7 +90,15 @@
         <w:pStyle w:val="ListBullet"/>
       </w:pPr>
       <w:r>
-        <w:t>The system will be built using a microservices architecture, with a focus on scalability, security, and high availability.</w:t>
+        <w:t>Artificial Intelligence (AI) and Machine Learning (ML) will be integrated to enhance threat detection and incident response capabilities.</w:t>
+      </w:r>
+    </w:p>
+    <w:p>
+      <w:pPr>
+        <w:pStyle w:val="ListBullet"/>
+      </w:pPr>
+      <w:r>
+        <w:t>The system will be designed with high-level scalability, security, and hosting considerations to ensure the protection of sensitive data.</w:t>
       </w:r>
     </w:p>
     <w:p>
@@ -106,7 +114,7 @@
         <w:pStyle w:val="ListBullet"/>
       </w:pPr>
       <w:r>
-        <w:t>The system will be designed with high-level scalability, security, and hosting considerations in mind, including compliance with relevant regulatory requirements.</w:t>
+        <w:t>The system will be deployed on Amazon Web Services (AWS) with API Gateway, Lambda, and S3 to ensure high availability and reliability.</w:t>
       </w:r>
     </w:p>
     <w:p>
@@ -114,15 +122,7 @@
         <w:pStyle w:val="ListBullet"/>
       </w:pPr>
       <w:r>
-        <w:t>The system will provide real-time monitoring and analytics, enabling swift identification and mitigation of potential threats.</w:t>
-      </w:r>
-    </w:p>
-    <w:p>
-      <w:pPr>
-        <w:pStyle w:val="ListBullet"/>
-      </w:pPr>
-      <w:r>
-        <w:t>The proposed system will be integrated with existing security systems, providing a comprehensive and unified cybersecurity solution.</w:t>
+        <w:t>The proposed solution will align with the client's business goals and deliver a secure, reliable, and user-friendly cybersecurity platform.</w:t>
       </w:r>
     </w:p>
     <w:p>
@@ -148,7 +148,7 @@
     </w:p>
     <w:p>
       <w:r>
-        <w:t>The first phase of the project will involve gathering and analyzing business requirements, identifying user roles and permissions, defining system behavior, and documenting any business rules or constraints. This phase will also involve conducting a thorough risk assessment to identify potential vulnerabilities and threats. The output of this phase will be a detailed Software Requirements Specification (SRS) document, which will serve as the foundation for the design and development phases.</w:t>
+        <w:t>In this phase, our team will conduct a thorough analysis of the client's business requirements and identify potential cyber threats. We will work closely with stakeholders to gather and document functional and non-functional requirements. The team will also analyze existing workflows, identify user roles and permissions, define system behavior, and document any business rules or constraints. All gathered requirements will be reviewed, prioritized, and compiled into a detailed Software Requirements Specification (SRS) document.</w:t>
       </w:r>
     </w:p>
     <w:p>
@@ -156,12 +156,12 @@
         <w:pStyle w:val="ListBullet"/>
       </w:pPr>
       <w:r>
-        <w:t>Phase 2: System Design and Architecture**</w:t>
+        <w:t>Phase 2: System Design**</w:t>
       </w:r>
     </w:p>
     <w:p>
       <w:r>
-        <w:t>In this phase, the team will design the overall system architecture, including the database schema, backend API, and frontend user interface. The team will also define the system's security and authentication mechanisms, including the use of encryption, firewalls, and access controls. The output of this phase will be a detailed System Design Document (SDD), which will outline the system's components, interfaces, and interactions.</w:t>
+        <w:t>In this phase, our team will design the architecture of the cybersecurity defence system. We will define the system's components, interfaces, and data flows. The team will also design the database schema, user interface, and user experience. The system will be designed with scalability, security, and usability in mind.</w:t>
       </w:r>
     </w:p>
     <w:p>
@@ -169,12 +169,12 @@
         <w:pStyle w:val="ListBullet"/>
       </w:pPr>
       <w:r>
-        <w:t>Phase 3: Database Design and Development**</w:t>
+        <w:t>Phase 3: Backend Development**</w:t>
       </w:r>
     </w:p>
     <w:p>
       <w:r>
-        <w:t>The third phase of the project will involve designing and developing the database schema, including the definition of data models, relationships, and constraints. The team will also develop the database using MongoDB with Atlas and Elasticsearch, and integrate it with the backend API. The output of this phase will be a fully functional database, with all necessary data models and relationships defined.</w:t>
+        <w:t>In this phase, our team will develop the backend of the cybersecurity defence system using Node.js, Express.js, and GraphQL. We will implement the system's logic, database integration, and API connectivity. The team will also ensure that the backend is secure, scalable, and reliable.</w:t>
       </w:r>
     </w:p>
     <w:p>
@@ -182,12 +182,12 @@
         <w:pStyle w:val="ListBullet"/>
       </w:pPr>
       <w:r>
-        <w:t>Phase 4: Backend API Development**</w:t>
+        <w:t>Phase 4: Frontend Development**</w:t>
       </w:r>
     </w:p>
     <w:p>
       <w:r>
-        <w:t>In this phase, the team will develop the backend API using Node.js with Express.js and GraphQL, including the definition of API endpoints, data models, and business logic. The team will also integrate the backend API with the database, and implement security and authentication mechanisms. The output of this phase will be a fully functional backend API, with all necessary endpoints and business logic defined.</w:t>
+        <w:t>In this phase, our team will develop the frontend of the cybersecurity defence system using React.js, Vite, and Redux. We will implement the user interface, user experience, and client-side logic. The team will also ensure that the frontend is secure, scalable, and reliable.</w:t>
       </w:r>
     </w:p>
     <w:p>
@@ -195,12 +195,12 @@
         <w:pStyle w:val="ListBullet"/>
       </w:pPr>
       <w:r>
-        <w:t>Phase 5: Frontend Development**</w:t>
+        <w:t>Phase 5: Artificial Intelligence and Machine Learning Integration**</w:t>
       </w:r>
     </w:p>
     <w:p>
       <w:r>
-        <w:t>The fifth phase of the project will involve developing the frontend user interface using React.js with Vite and Redux, including the definition of user interface components, layouts, and interactions. The team will also integrate the frontend with the backend API, and implement security and authentication mechanisms. The output of this phase will be a fully functional frontend, with all necessary user interface components and interactions defined.</w:t>
+        <w:t>In this phase, our team will integrate AI and ML into the cybersecurity defence system to enhance threat detection and incident response capabilities. We will utilize machine learning algorithms to analyze patterns and anomalies in the data. The team will also ensure that the AI and ML models are accurate, reliable, and scalable.</w:t>
       </w:r>
     </w:p>
     <w:p>
@@ -213,7 +213,7 @@
     </w:p>
     <w:p>
       <w:r>
-        <w:t>In this phase, the team will conduct thorough testing and quality assurance, including unit testing, integration testing, and system testing. The team will also conduct security testing and performance validation, to ensure that the system meets all necessary security and performance requirements. The output of this phase will be a fully tested and validated system, with all necessary defects and issues identified and resolved.</w:t>
+        <w:t>In this phase, our team will conduct thorough testing and quality assurance of the cybersecurity defence system. We will perform unit testing, integration testing, and system testing to ensure that the system meets the requirements and is free of defects. The team will also conduct security testing and performance testing to ensure that the system is secure and scalable.</w:t>
       </w:r>
     </w:p>
     <w:p>
@@ -221,17 +221,12 @@
         <w:pStyle w:val="ListBullet"/>
       </w:pPr>
       <w:r>
-        <w:t>Phase 7: Deployment and Maintenance**</w:t>
+        <w:t>Phase 7: Deployment**</w:t>
       </w:r>
     </w:p>
     <w:p>
       <w:r>
-        <w:t>The final phase of the project will involve deploying the system to production, including the setup of necessary infrastructure, configuration of security and authentication mechanisms, and integration with existing systems. The team will also provide ongoing maintenance and support, including the identification and resolution of defects and issues, and the implementation of necessary updates and upgrades. The output of this phase will be a fully deployed and operational system, with all necessary maintenance and support activities defined and implemented.</w:t>
-      </w:r>
-    </w:p>
-    <w:p>
-      <w:r>
-        <w:t>The scope of the project includes the design, development, testing, and deployment of a comprehensive cybersecurity defence system, including all necessary components, interfaces, and interactions. The system will be designed to protect against advanced cyber threats, leveraging cutting-edge technologies to safeguard against potential digital attacks. The system will be built using a microservices architecture, with a focus on scalability, security, and high availability.</w:t>
+        <w:t>In this phase, our team will deploy the cybersecurity defence system on AWS with API Gateway, Lambda, and S3. We will ensure that the system is highly available, scalable, and reliable. The team will also provide documentation and training to the client's team.</w:t>
       </w:r>
     </w:p>
     <w:p>
@@ -570,7 +565,7 @@
           </w:tcPr>
           <w:p>
             <w:r>
-              <w:t>Machine Learning (ML) using TensorFlow and scikit-learn</w:t>
+              <w:t>Machine Learning using TensorFlow and Scikit-learn</w:t>
             </w:r>
           </w:p>
         </w:tc>
@@ -620,7 +615,7 @@
           </w:tcPr>
           <w:p>
             <w:r>
-              <w:t>JSON Web Token (JWT) Authentication</w:t>
+              <w:t>JSON Web Token Authentication</w:t>
             </w:r>
           </w:p>
         </w:tc>
@@ -670,7 +665,7 @@
           </w:tcPr>
           <w:p>
             <w:r>
-              <w:t>Amazon Simple Storage Service (S3)</w:t>
+              <w:t>Amazon Simple Storage Service</w:t>
             </w:r>
           </w:p>
         </w:tc>
@@ -882,7 +877,7 @@
           </w:tcPr>
           <w:p>
             <w:r>
-              <w:t>Software Requirements Specification (SRS) document</w:t>
+              <w:t>Software Requirements Specification, Architecture Design, Database Schema</w:t>
             </w:r>
           </w:p>
         </w:tc>
@@ -900,7 +895,7 @@
           </w:tcPr>
           <w:p>
             <w:r>
-              <w:t>System Design and Architecture</w:t>
+              <w:t>System Design</w:t>
             </w:r>
           </w:p>
         </w:tc>
@@ -932,7 +927,7 @@
           </w:tcPr>
           <w:p>
             <w:r>
-              <w:t>System Design Document (SDD)</w:t>
+              <w:t>System Architecture, Database Schema, User Interface Design</w:t>
             </w:r>
           </w:p>
         </w:tc>
@@ -950,57 +945,7 @@
           </w:tcPr>
           <w:p>
             <w:r>
-              <w:t>Database Design and Development</w:t>
-            </w:r>
-          </w:p>
-        </w:tc>
-        <w:tc>
-          <w:tcPr>
-            <w:tcW w:type="dxa" w:w="3120"/>
-            <w:tcMar>
-              <w:top w:w="100" w:type="dxa"/>
-              <w:bottom w:w="100" w:type="dxa"/>
-              <w:left w:w="150" w:type="dxa"/>
-              <w:right w:w="150" w:type="dxa"/>
-            </w:tcMar>
-          </w:tcPr>
-          <w:p>
-            <w:r>
-              <w:t>3 Weeks</w:t>
-            </w:r>
-          </w:p>
-        </w:tc>
-        <w:tc>
-          <w:tcPr>
-            <w:tcW w:type="dxa" w:w="3120"/>
-            <w:tcMar>
-              <w:top w:w="100" w:type="dxa"/>
-              <w:bottom w:w="100" w:type="dxa"/>
-              <w:left w:w="150" w:type="dxa"/>
-              <w:right w:w="150" w:type="dxa"/>
-            </w:tcMar>
-          </w:tcPr>
-          <w:p>
-            <w:r>
-              <w:t>Fully functional database</w:t>
-            </w:r>
-          </w:p>
-        </w:tc>
-      </w:tr>
-      <w:tr>
-        <w:tc>
-          <w:tcPr>
-            <w:tcW w:type="dxa" w:w="3120"/>
-            <w:tcMar>
-              <w:top w:w="100" w:type="dxa"/>
-              <w:bottom w:w="100" w:type="dxa"/>
-              <w:left w:w="150" w:type="dxa"/>
-              <w:right w:w="150" w:type="dxa"/>
-            </w:tcMar>
-          </w:tcPr>
-          <w:p>
-            <w:r>
-              <w:t>Backend API Development</w:t>
+              <w:t>Backend Development</w:t>
             </w:r>
           </w:p>
         </w:tc>
@@ -1032,7 +977,7 @@
           </w:tcPr>
           <w:p>
             <w:r>
-              <w:t>Fully functional backend API</w:t>
+              <w:t>Secure RESTful APIs with Authentication</w:t>
             </w:r>
           </w:p>
         </w:tc>
@@ -1082,7 +1027,57 @@
           </w:tcPr>
           <w:p>
             <w:r>
-              <w:t>Fully functional frontend</w:t>
+              <w:t>High Fidelity Responsive Interface Designs</w:t>
+            </w:r>
+          </w:p>
+        </w:tc>
+      </w:tr>
+      <w:tr>
+        <w:tc>
+          <w:tcPr>
+            <w:tcW w:type="dxa" w:w="3120"/>
+            <w:tcMar>
+              <w:top w:w="100" w:type="dxa"/>
+              <w:bottom w:w="100" w:type="dxa"/>
+              <w:left w:w="150" w:type="dxa"/>
+              <w:right w:w="150" w:type="dxa"/>
+            </w:tcMar>
+          </w:tcPr>
+          <w:p>
+            <w:r>
+              <w:t>Artificial Intelligence and Machine Learning Integration</w:t>
+            </w:r>
+          </w:p>
+        </w:tc>
+        <w:tc>
+          <w:tcPr>
+            <w:tcW w:type="dxa" w:w="3120"/>
+            <w:tcMar>
+              <w:top w:w="100" w:type="dxa"/>
+              <w:bottom w:w="100" w:type="dxa"/>
+              <w:left w:w="150" w:type="dxa"/>
+              <w:right w:w="150" w:type="dxa"/>
+            </w:tcMar>
+          </w:tcPr>
+          <w:p>
+            <w:r>
+              <w:t>2 Weeks</w:t>
+            </w:r>
+          </w:p>
+        </w:tc>
+        <w:tc>
+          <w:tcPr>
+            <w:tcW w:type="dxa" w:w="3120"/>
+            <w:tcMar>
+              <w:top w:w="100" w:type="dxa"/>
+              <w:bottom w:w="100" w:type="dxa"/>
+              <w:left w:w="150" w:type="dxa"/>
+              <w:right w:w="150" w:type="dxa"/>
+            </w:tcMar>
+          </w:tcPr>
+          <w:p>
+            <w:r>
+              <w:t>Working AI and ML Models</w:t>
             </w:r>
           </w:p>
         </w:tc>
@@ -1116,7 +1111,7 @@
           </w:tcPr>
           <w:p>
             <w:r>
-              <w:t>3 Weeks</w:t>
+              <w:t>2 Weeks</w:t>
             </w:r>
           </w:p>
         </w:tc>
@@ -1132,7 +1127,7 @@
           </w:tcPr>
           <w:p>
             <w:r>
-              <w:t>Fully tested and validated system</w:t>
+              <w:t>Test Reports, Security Audit Reports</w:t>
             </w:r>
           </w:p>
         </w:tc>
@@ -1150,7 +1145,7 @@
           </w:tcPr>
           <w:p>
             <w:r>
-              <w:t>Deployment and Maintenance</w:t>
+              <w:t>Deployment</w:t>
             </w:r>
           </w:p>
         </w:tc>
@@ -1182,7 +1177,7 @@
           </w:tcPr>
           <w:p>
             <w:r>
-              <w:t>Fully deployed and operational system</w:t>
+              <w:t>Production Deployment Documentation and User Acceptance Testing</w:t>
             </w:r>
           </w:p>
         </w:tc>
@@ -1216,53 +1211,83 @@
       </w:r>
     </w:p>
     <w:p>
+      <w:pPr>
+        <w:pStyle w:val="ListBullet"/>
+      </w:pPr>
       <w:r>
-        <w:t>The client will provide necessary access to existing systems and infrastructure.</w:t>
+        <w:t>The client will provide access to relevant stakeholders and subject matter experts throughout the project.</w:t>
       </w:r>
     </w:p>
     <w:p>
+      <w:pPr>
+        <w:pStyle w:val="ListBullet"/>
+      </w:pPr>
       <w:r>
-        <w:t>The client will provide necessary documentation and information about existing security systems and protocols.</w:t>
+        <w:t>The client will provide necessary infrastructure and equipment for testing and deployment.</w:t>
       </w:r>
     </w:p>
     <w:p>
+      <w:pPr>
+        <w:pStyle w:val="ListBullet"/>
+      </w:pPr>
       <w:r>
-        <w:t>The client will be available to provide feedback and input throughout the project.</w:t>
+        <w:t>The client will provide access to third-party APIs and services as required.</w:t>
       </w:r>
     </w:p>
     <w:p>
+      <w:pPr>
+        <w:pStyle w:val="ListBullet"/>
+      </w:pPr>
       <w:r>
-        <w:t>The project timeline and budget will be sufficient to complete all necessary tasks and deliverables.</w:t>
+        <w:t>The AI and ML models will be accurate and reliable.</w:t>
       </w:r>
     </w:p>
     <w:p>
+      <w:pPr>
+        <w:pStyle w:val="ListBullet"/>
+      </w:pPr>
       <w:r>
-        <w:t>The project team will have necessary skills and expertise to complete all tasks and deliverables.</w:t>
+        <w:t>The client will provide necessary security approvals and compliance documentation.</w:t>
       </w:r>
     </w:p>
     <w:p>
+      <w:pPr>
+        <w:pStyle w:val="ListBullet"/>
+      </w:pPr>
       <w:r>
-        <w:t>The project team will have access to necessary tools and technologies to complete all tasks and deliverables.</w:t>
+        <w:t>The client will provide necessary deployment approvals and documentation.</w:t>
       </w:r>
     </w:p>
     <w:p>
+      <w:pPr>
+        <w:pStyle w:val="ListBullet"/>
+      </w:pPr>
       <w:r>
-        <w:t>The client will provide necessary testing and validation environments and data.</w:t>
+        <w:t>The project timeline and budget will be sufficient to complete the project.</w:t>
       </w:r>
     </w:p>
     <w:p>
+      <w:pPr>
+        <w:pStyle w:val="ListBullet"/>
+      </w:pPr>
       <w:r>
-        <w:t>The project team will be able to integrate with existing systems and infrastructure without significant issues or delays.</w:t>
+        <w:t>The client will provide necessary feedback and input throughout the project.</w:t>
       </w:r>
     </w:p>
     <w:p>
+      <w:pPr>
+        <w:pStyle w:val="ListBullet"/>
+      </w:pPr>
       <w:r>
-        <w:t>The project team will be able to obtain necessary security approvals and certifications.</w:t>
+        <w:t>The project team will have the necessary skills and expertise to complete the project.</w:t>
       </w:r>
     </w:p>
     <w:p>
+      <w:pPr>
+        <w:pStyle w:val="ListBullet"/>
+      </w:pPr>
       <w:r>
-        <w:t>The project team will be able to deploy the system to production without significant issues or delays.</w:t>
+        <w:t>The project will not be impacted by any external factors or dependencies.</w:t>
       </w:r>
     </w:p>
     <w:p>
@@ -1279,53 +1304,75 @@
       </w:r>
     </w:p>
     <w:p>
+      <w:pPr>
+        <w:pStyle w:val="ListBullet"/>
+      </w:pPr>
       <w:r>
-        <w:t>Changes in business requirements during development.</w:t>
+        <w:t>Risk: Changes in business requirements during development. Mitigation: Adopt Agile sprint planning with regular stakeholder reviews.</w:t>
       </w:r>
     </w:p>
     <w:p>
+      <w:pPr>
+        <w:pStyle w:val="ListBullet"/>
+      </w:pPr>
       <w:r>
-        <w:t>Delays in receiving necessary feedback and input from the client.</w:t>
+        <w:t>Risk: Delays in receiving necessary infrastructure and equipment. Mitigation: Work closely with the client to ensure timely delivery of necessary infrastructure and equipment.</w:t>
       </w:r>
     </w:p>
     <w:p>
+      <w:pPr>
+        <w:pStyle w:val="ListBullet"/>
+      </w:pPr>
       <w:r>
-        <w:t>Issues with integrating with existing systems and infrastructure.</w:t>
+        <w:t>Risk: Issues with third-party APIs and services. Mitigation: Develop contingency plans and work closely with third-party providers to ensure timely resolution of issues.</w:t>
       </w:r>
     </w:p>
     <w:p>
+      <w:pPr>
+        <w:pStyle w:val="ListBullet"/>
+      </w:pPr>
       <w:r>
-        <w:t>Delays in obtaining necessary security approvals and certifications.</w:t>
+        <w:t>Risk: Inaccurate or unreliable AI and ML models. Mitigation: Conduct thorough testing and validation of AI and ML models.</w:t>
       </w:r>
     </w:p>
     <w:p>
+      <w:pPr>
+        <w:pStyle w:val="ListBullet"/>
+      </w:pPr>
       <w:r>
-        <w:t>Issues with deploying the system to production.</w:t>
+        <w:t>Risk: Security breaches or vulnerabilities. Mitigation: Conduct regular security testing and audits, and implement necessary security measures.</w:t>
       </w:r>
     </w:p>
     <w:p>
+      <w:pPr>
+        <w:pStyle w:val="ListBullet"/>
+      </w:pPr>
       <w:r>
-        <w:t>Changes in project timeline and budget.</w:t>
+        <w:t>Risk: Deployment issues or delays. Mitigation: Work closely with the client to ensure timely and successful deployment.</w:t>
       </w:r>
     </w:p>
     <w:p>
+      <w:pPr>
+        <w:pStyle w:val="ListBullet"/>
+      </w:pPr>
       <w:r>
-        <w:t>Issues with accessing necessary tools and technologies.</w:t>
+        <w:t>Risk: Insufficient project timeline or budget. Mitigation: Work closely with the client to ensure sufficient project timeline and budget.</w:t>
       </w:r>
     </w:p>
     <w:p>
+      <w:pPr>
+        <w:pStyle w:val="ListBullet"/>
+      </w:pPr>
       <w:r>
-        <w:t>Delays in receiving necessary testing and validation environments and data.</w:t>
+        <w:t>Risk: Lack of necessary skills or expertise. Mitigation: Provide necessary training and support to the project team.</w:t>
       </w:r>
     </w:p>
     <w:p>
+      <w:pPr>
+        <w:pStyle w:val="ListBullet"/>
+      </w:pPr>
       <w:r>
-        <w:t>Issues with obtaining necessary access to existing systems and infrastructure.</w:t>
-      </w:r>
-    </w:p>
-    <w:p>
-      <w:r>
-        <w:t>Changes in project scope and requirements.</w:t>
+        <w:t>Risk: External factors or dependencies impacting the project. Mitigation: Develop contingency plans and work closely with stakeholders to ensure timely resolution of issues.</w:t>
       </w:r>
     </w:p>
     <w:p>
@@ -1462,7 +1509,7 @@
           </w:tcPr>
           <w:p>
             <w:r>
-              <w:t>320 Hours</w:t>
+              <w:t>160 Hours</w:t>
             </w:r>
           </w:p>
         </w:tc>
@@ -1512,7 +1559,7 @@
           </w:tcPr>
           <w:p>
             <w:r>
-              <w:t>640 Hours</w:t>
+              <w:t>320 Hours</w:t>
             </w:r>
           </w:p>
         </w:tc>
@@ -1562,7 +1609,57 @@
           </w:tcPr>
           <w:p>
             <w:r>
-              <w:t>640 Hours</w:t>
+              <w:t>320 Hours</w:t>
+            </w:r>
+          </w:p>
+        </w:tc>
+      </w:tr>
+      <w:tr>
+        <w:tc>
+          <w:tcPr>
+            <w:tcW w:type="dxa" w:w="3120"/>
+            <w:tcMar>
+              <w:top w:w="100" w:type="dxa"/>
+              <w:bottom w:w="100" w:type="dxa"/>
+              <w:left w:w="150" w:type="dxa"/>
+              <w:right w:w="150" w:type="dxa"/>
+            </w:tcMar>
+          </w:tcPr>
+          <w:p>
+            <w:r>
+              <w:t>Data Scientist</w:t>
+            </w:r>
+          </w:p>
+        </w:tc>
+        <w:tc>
+          <w:tcPr>
+            <w:tcW w:type="dxa" w:w="3120"/>
+            <w:tcMar>
+              <w:top w:w="100" w:type="dxa"/>
+              <w:bottom w:w="100" w:type="dxa"/>
+              <w:left w:w="150" w:type="dxa"/>
+              <w:right w:w="150" w:type="dxa"/>
+            </w:tcMar>
+          </w:tcPr>
+          <w:p>
+            <w:r>
+              <w:t>Artificial Intelligence and Machine Learning Integration</w:t>
+            </w:r>
+          </w:p>
+        </w:tc>
+        <w:tc>
+          <w:tcPr>
+            <w:tcW w:type="dxa" w:w="3120"/>
+            <w:tcMar>
+              <w:top w:w="100" w:type="dxa"/>
+              <w:bottom w:w="100" w:type="dxa"/>
+              <w:left w:w="150" w:type="dxa"/>
+              <w:right w:w="150" w:type="dxa"/>
+            </w:tcMar>
+          </w:tcPr>
+          <w:p>
+            <w:r>
+              <w:t>160 Hours</w:t>
             </w:r>
           </w:p>
         </w:tc>
@@ -1612,7 +1709,7 @@
           </w:tcPr>
           <w:p>
             <w:r>
-              <w:t>320 Hours</w:t>
+              <w:t>160 Hours</w:t>
             </w:r>
           </w:p>
         </w:tc>
@@ -1646,7 +1743,7 @@
           </w:tcPr>
           <w:p>
             <w:r>
-              <w:t>Deployment and Maintenance</w:t>
+              <w:t>Deployment</w:t>
             </w:r>
           </w:p>
         </w:tc>
@@ -1662,7 +1759,7 @@
           </w:tcPr>
           <w:p>
             <w:r>
-              <w:t>160 Hours</w:t>
+              <w:t>80 Hours</w:t>
             </w:r>
           </w:p>
         </w:tc>

</xml_diff>